<commit_message>
docs: correct report after fact-check against the code
- testing strategy no longer claims every branch is covered; names the
  two error paths without automatic tests
- F18 now passes only if every other test passed; F19 compares all
  source files
- system model edges match the real calls (bank.js functions; i18n.js
  reaches localStorage through storage.js)
- smaller wording fixes in Tables A1, C1, C6 and Techniques 3, 6, 7

Co-Authored-By: Claude Opus 5.5 <noreply@anthropic.com>
Claude-Session: https://claude.ai/code/session_01XD7kt4NUT5bnr3NetjtefG
</commit_message>
<xml_diff>
--- a/docs/ia/IA_Driving_Theory_Practice.docx
+++ b/docs/ia/IA_Driving_Theory_Practice.docx
@@ -93,7 +93,7 @@
           <w:sz w:val="28"/>
           <w:szCs w:val="28"/>
         </w:rPr>
-        <w:t xml:space="preserve">Word count: 1982</w:t>
+        <w:t xml:space="preserve">Word count: 1992</w:t>
       </w:r>
     </w:p>
     <w:p>
@@ -631,7 +631,7 @@
                 <w:sz w:val="17"/>
                 <w:szCs w:val="17"/>
               </w:rPr>
-              <w:t xml:space="preserve">Four screens do not need a component framework or build step. The CSV parser is written by hand so the algorithm is visible (Criterion D).</w:t>
+              <w:t xml:space="preserve">Four screens do not need a component framework. Tailwind is built once into css/styles.css, so the app needs no build step to run. The CSV parser is written by hand so the algorithm is visible (Criterion D).</w:t>
             </w:r>
           </w:p>
         </w:tc>
@@ -2645,7 +2645,7 @@
       <w:r>
         <w:drawing>
           <wp:inline distT="0" distB="0" distL="0" distR="0">
-            <wp:extent cx="5334000" cy="6276975"/>
+            <wp:extent cx="4581525" cy="6667500"/>
             <wp:effectExtent t="0" r="0" b="0" l="0"/>
             <wp:docPr id="1" name="system_model.png" descr="Figure C1 — System model: files, data stores and the functions through which they interact" title="Figure C1 — System model: files, data stores and the functions through which they interact"/>
             <wp:cNvGraphicFramePr>
@@ -2670,7 +2670,7 @@
                   <pic:spPr bwMode="auto">
                     <a:xfrm>
                       <a:off x="0" y="0"/>
-                      <a:ext cx="5334000" cy="6276975"/>
+                      <a:ext cx="4581525" cy="6667500"/>
                     </a:xfrm>
                     <a:prstGeom prst="rect">
                       <a:avLst/>
@@ -2821,7 +2821,7 @@
                 <w:sz w:val="17"/>
                 <w:szCs w:val="17"/>
               </w:rPr>
-              <w:t xml:space="preserve">Rule (checked by isValidQuestion)</w:t>
+              <w:t xml:space="preserve">Rule (✓ = checked by isValidQuestion)</w:t>
             </w:r>
           </w:p>
         </w:tc>
@@ -3017,7 +3017,7 @@
                 <w:sz w:val="17"/>
                 <w:szCs w:val="17"/>
               </w:rPr>
-              <w:t xml:space="preserve">Must not be empty.</w:t>
+              <w:t xml:space="preserve">✓ Must not be empty.</w:t>
             </w:r>
           </w:p>
         </w:tc>
@@ -3115,7 +3115,7 @@
                 <w:sz w:val="17"/>
                 <w:szCs w:val="17"/>
               </w:rPr>
-              <w:t xml:space="preserve">2–4 options; unused options are empty.</w:t>
+              <w:t xml:space="preserve">Up to 4 options; unused options are empty.</w:t>
             </w:r>
           </w:p>
         </w:tc>
@@ -3213,7 +3213,7 @@
                 <w:sz w:val="17"/>
                 <w:szCs w:val="17"/>
               </w:rPr>
-              <w:t xml:space="preserve">Must point at a non-empty option.</w:t>
+              <w:t xml:space="preserve">✓ Must be 1–4 and point at a non-empty option.</w:t>
             </w:r>
           </w:p>
         </w:tc>
@@ -3311,7 +3311,7 @@
                 <w:sz w:val="17"/>
                 <w:szCs w:val="17"/>
               </w:rPr>
-              <w:t xml:space="preserve">1 Easy, 2 Medium, 3 Hard.</w:t>
+              <w:t xml:space="preserve">✓ Must be 1–3: 1 Easy, 2 Medium, 3 Hard.</w:t>
             </w:r>
           </w:p>
         </w:tc>
@@ -6037,7 +6037,7 @@
         <w:spacing w:after="120" w:line="276"/>
       </w:pPr>
       <w:r>
-        <w:t xml:space="preserve">Testing is done at two levels. Structural (white-box) tests (Table C5) call each major function inside the running application with valid, extreme and invalid data, so that every branch, including the error paths, runs at least once. Functional (black-box) tests (Table C4) check every success criterion through the interface only, by clicking, typing and uploading files, and look up the correct answers in the CSV file rather than in the program. Generated test files (Table C6) make the expected results exact: fixed_30.csv holds ten questions of each difficulty, so its maximum score is 60 by hand calculation. Both levels are automated so that they can be repeated after every change.</w:t>
+        <w:t xml:space="preserve">Testing is done at two levels. Structural (white-box) tests (Table C5) call each major function inside the running application with valid, extreme and invalid data, so that the main branches and the error paths for invalid rows, corrupted storage and full storage are exercised. Functional (black-box) tests (Table C4) check every success criterion through the interface only, by clicking, typing and uploading files, and look up the correct answers in the CSV file rather than in the program. Generated test files (Table C6) make the expected results exact: fixed_30.csv holds ten questions of each difficulty, so its maximum score is 60 by hand calculation. Both levels are automated so that they can be repeated after every change.</w:t>
       </w:r>
     </w:p>
     <w:tbl>
@@ -8478,7 +8478,7 @@
                 <w:sz w:val="17"/>
                 <w:szCs w:val="17"/>
               </w:rPr>
-              <w:t xml:space="preserve">Run the whole suite in Chromium 141.0.7390.37 (the engine also used by Chrome and Edge)</w:t>
+              <w:t xml:space="preserve">Run every other test in Chromium 141.0.7390.37 (the engine also used by Chrome and Edge), with no installation and no server-side code</w:t>
             </w:r>
           </w:p>
         </w:tc>
@@ -8509,7 +8509,7 @@
                 <w:sz w:val="17"/>
                 <w:szCs w:val="17"/>
               </w:rPr>
-              <w:t xml:space="preserve">every screen works with no installation and no server-side code</w:t>
+              <w:t xml:space="preserve">all other structural and functional tests pass</w:t>
             </w:r>
           </w:p>
         </w:tc>
@@ -10254,7 +10254,7 @@
                 <w:sz w:val="17"/>
                 <w:szCs w:val="17"/>
               </w:rPr>
-              <w:t xml:space="preserve">empty string (empty.csv)</w:t>
+              <w:t xml:space="preserve">empty string "" (the content of empty.csv)</w:t>
             </w:r>
           </w:p>
         </w:tc>
@@ -14875,7 +14875,7 @@
                 <w:sz w:val="17"/>
                 <w:szCs w:val="17"/>
               </w:rPr>
-              <w:t xml:space="preserve">F6–F9, F12, F17, F20, S24–S27</w:t>
+              <w:t xml:space="preserve">F6–F9, F12, F17, F20, S14, S24–S27</w:t>
             </w:r>
           </w:p>
         </w:tc>
@@ -15267,7 +15267,7 @@
                 <w:sz w:val="17"/>
                 <w:szCs w:val="17"/>
               </w:rPr>
-              <w:t xml:space="preserve">F16, S3, S5</w:t>
+              <w:t xml:space="preserve">F16, S3 (S5 parses the same empty text directly)</w:t>
             </w:r>
           </w:p>
         </w:tc>
@@ -15311,7 +15311,7 @@
         <w:spacing w:after="120" w:line="276"/>
       </w:pPr>
       <w:r>
-        <w:t xml:space="preserve">The product has eight JavaScript files (Table D1): one per component of Figure B1, plus app.js for the shared state and the event listeners. This let each part be tested on its own (S1–S31).</w:t>
+        <w:t xml:space="preserve">The product has eight JavaScript files (Table D1), grouped by the components of Figure B1, plus app.js for the shared state and the event listeners. This let each part be tested on its own (S1–S31).</w:t>
       </w:r>
     </w:p>
     <w:tbl>
@@ -17524,7 +17524,7 @@
         <w:t xml:space="preserve">Evaluation.</w:t>
       </w:r>
       <w:r>
-        <w:t xml:space="preserve"> Splitting the text on line breaks and then on commas is simpler but fails on this data: 48 questions in db.lt.csv contain a line break inside a quoted field and 131 contain a comma in the question or an option, so their columns would shift. The PapaParse library [5] would handle this but adds a dependency and hides the algorithm. One pass is O(n) in the length of the file; 500 questions loaded in 25 ms (F14). A weakness remains: an unclosed quote turns the rest of the file into one field, and the faulty line is not reported.</w:t>
+        <w:t xml:space="preserve"> Splitting the text on line breaks and then on commas is simpler but fails on this data: 48 questions in db.lt.csv contain a line break inside a quoted field and 131 contain a comma in the question or an option, so their columns would shift. The PapaParse library [5] would handle this but adds a dependency and hides the algorithm. One pass is O(n) in the length of the file; 500 questions loaded in 26 ms (F14). A weakness remains: an unclosed quote turns the rest of the file into one field, and the faulty line is not reported.</w:t>
       </w:r>
     </w:p>
     <w:p>
@@ -17859,7 +17859,7 @@
         <w:t xml:space="preserve">Testing.</w:t>
       </w:r>
       <w:r>
-        <w:t xml:space="preserve"> S9–S14 and F3–F5. In S10 each of the six orders appeared 9,830–10,138 times.</w:t>
+        <w:t xml:space="preserve"> S9–S14 and F3–F5. In S10 each of the six orders appeared 9,904–10,140 times.</w:t>
       </w:r>
     </w:p>
     <w:p>
@@ -18467,7 +18467,7 @@
         <w:t xml:space="preserve">Evaluation.</w:t>
       </w:r>
       <w:r>
-        <w:t xml:space="preserve"> The plan in Criterion B used nested conditionals. The lookup table keeps the rule in one line and works on the number, not on the translated label (“Easy” or “Lengvas”). Points are whole numbers, so the total cannot contain rounding errors (CfS 5); only the percentage is rounded. Without the </w:t>
+        <w:t xml:space="preserve"> Nested conditionals would also work, but the lookup table keeps the rule in one line and works on the number, not on the translated label (“Easy” or “Lengvas”). Points are whole numbers, so the total cannot contain rounding errors (CfS 5); only the percentage is rounded. Without the </w:t>
       </w:r>
       <w:r>
         <w:rPr>
@@ -18478,7 +18478,7 @@
         <w:t xml:space="preserve">answered</w:t>
       </w:r>
       <w:r>
-        <w:t xml:space="preserve"> flag a double click, or a key pressed after a click, would score twice.</w:t>
+        <w:t xml:space="preserve"> flag a double click would score twice.</w:t>
       </w:r>
     </w:p>
     <w:p>
@@ -19705,7 +19705,7 @@
         <w:t xml:space="preserve">Math.floor</w:t>
       </w:r>
       <w:r>
-        <w:t xml:space="preserve"> rounds the elapsed time down, so the result can be up to one second short of the true time, whereas the criterion asks for the nearest second.</w:t>
+        <w:t xml:space="preserve"> rounds down, so the time can be up to one second short instead of the nearest second.</w:t>
       </w:r>
     </w:p>
     <w:p>
@@ -20035,7 +20035,7 @@
         <w:t xml:space="preserve">Technique.</w:t>
       </w:r>
       <w:r>
-        <w:t xml:space="preserve"> Each finished or ended session is stored as one JSON record (Table C3) under a key per profile. </w:t>
+        <w:t xml:space="preserve"> Each session with at least one answer is stored as one JSON record (Table C3) under a key per profile. </w:t>
       </w:r>
       <w:r>
         <w:rPr>
@@ -20355,7 +20355,7 @@
         <w:t xml:space="preserve">resolveImageSrc()</w:t>
       </w:r>
       <w:r>
-        <w:t xml:space="preserve"> chooses between an https:// link, the assets folder and these URLs. A user's bank never falls back to assets/, where 5.jpg would show a picture of a different question; a missing picture is reported instead (F21). Results are stored per bank for the same reason.</w:t>
+        <w:t xml:space="preserve"> chooses between an https:// link, the assets folder and these URLs. A user's bank never falls back to assets/, where 5.jpg would show a picture of a different question; a missing picture is reported instead (F21). For the same reason every record stores its bank, and statistics are kept apart by bank.</w:t>
       </w:r>
     </w:p>
     <w:p>
@@ -20379,7 +20379,7 @@
         <w:spacing w:after="120" w:line="276"/>
       </w:pPr>
       <w:r>
-        <w:t xml:space="preserve">The strategy was effective: it exposed three defects that normal use had not shown, all now fixed: S4 (escaped quotes), F15 (key hint missing on the quiz screen) and F24 (offline, Tailwind CSS could not load from its CDN, so all four screens appeared at once; the stylesheet is now built into css/styles.css). All three tests fail on commit 12a16ba and pass now (tests/results_before_fix.txt), which shows they detect what they claim to. Extreme and invalid data were the most productive, and randomness was tested statistically because one run proves nothing. Its limits: one browser engine on a Linux computer rather than a school laptop, and usability measured through the interface rather than with users.</w:t>
+        <w:t xml:space="preserve">The strategy was effective: it exposed three defects that normal use had not shown, all now fixed: S4 (escaped quotes), F15 (key hint missing on the quiz screen) and F24 (offline, Tailwind CSS could not load from its CDN, so all four screens appeared at once; the stylesheet is now built into css/styles.css). All three tests fail on commit 12a16ba and pass now (tests/results_before_fix.txt), which shows they detect what they claim to. Extreme and invalid data were the most productive, and randomness was tested statistically because one run proves nothing. Its limits: one browser engine on a Linux computer rather than a school laptop, usability measured through the interface rather than with users, and no automatic test of a failed bank download or a file-read error.</w:t>
       </w:r>
     </w:p>
     <w:tbl>
@@ -22140,7 +22140,7 @@
                 <w:sz w:val="17"/>
                 <w:szCs w:val="17"/>
               </w:rPr>
-              <w:t xml:space="preserve">123: 10138, 132: 10049, 213: 10043, 231: 10010, 312: 9930, 321: 9830</w:t>
+              <w:t xml:space="preserve">123: 10140, 132: 9966, 213: 9943, 231: 10104, 312: 9943, 321: 9904</w:t>
             </w:r>
           </w:p>
         </w:tc>
@@ -27250,7 +27250,7 @@
                 <w:sz w:val="17"/>
                 <w:szCs w:val="17"/>
               </w:rPr>
-              <w:t xml:space="preserve">score 39 of 60 (65%); correct 20 + incorrect 10; Easy 8/10 (80%), Medium 5/10 (50%), Hard 7/10 (70%)</w:t>
+              <w:t xml:space="preserve">score 39 of 60 (65%); correct 20 + incorrect 10; Easy 7/10 (70%), Medium 7/10 (70%), Hard 6/10 (60%)</w:t>
             </w:r>
           </w:p>
         </w:tc>
@@ -27510,7 +27510,7 @@
                 <w:sz w:val="17"/>
                 <w:szCs w:val="17"/>
               </w:rPr>
-              <w:t xml:space="preserve">loaded in 25 ms (upload to message); slowest answer 0.4 ms</w:t>
+              <w:t xml:space="preserve">loaded in 26 ms (upload to message); slowest answer 0.4 ms</w:t>
             </w:r>
           </w:p>
         </w:tc>
@@ -27640,7 +27640,7 @@
                 <w:sz w:val="17"/>
                 <w:szCs w:val="17"/>
               </w:rPr>
-              <w:t xml:space="preserve">Start ready after 62 ms; 1 click to start; visible on every question: true</w:t>
+              <w:t xml:space="preserve">Start ready after 72 ms; 1 click to start; visible on every question: true</w:t>
             </w:r>
           </w:p>
         </w:tc>
@@ -28030,7 +28030,7 @@
                 <w:sz w:val="17"/>
                 <w:szCs w:val="17"/>
               </w:rPr>
-              <w:t xml:space="preserve">suite ran in Chromium 141.0.7390.37</w:t>
+              <w:t xml:space="preserve">all 54 other tests passed in Chromium 141.0.7390.37</w:t>
             </w:r>
           </w:p>
         </w:tc>
@@ -30065,7 +30065,7 @@
                 <w:sz w:val="17"/>
                 <w:szCs w:val="17"/>
               </w:rPr>
-              <w:t xml:space="preserve">F14: 25 ms load, 0.4 ms per answer, on a fast computer; not yet measured on a school laptop.</w:t>
+              <w:t xml:space="preserve">F14: 26 ms load, 0.4 ms per answer, on a fast computer; not yet measured on a school laptop.</w:t>
             </w:r>
           </w:p>
         </w:tc>
@@ -30593,7 +30593,7 @@
         <w:t xml:space="preserve">Math.floor</w:t>
       </w:r>
       <w:r>
-        <w:t xml:space="preserve"> rounds down rather than to the nearest second. Portability is partly met, because the product has run only in Chromium on Linux, and the performance margins (25 ms against 2,000 ms) were measured on a fast computer, not a school laptop. Reliability is the strongest result: testing found three defects, one of which made the product unusable offline, and all were fixed.</w:t>
+        <w:t xml:space="preserve"> rounds down rather than to the nearest second. Portability is partly met, because the product has run only in Chromium on Linux, and the performance margins (26 ms against 2,000 ms) were measured on a fast computer, not a school laptop. Reliability is the strongest result: testing found three defects, one of which made the product unusable offline, and all were fixed.</w:t>
       </w:r>
     </w:p>
     <w:p>

</xml_diff>

<commit_message>
docs: add script that records the IA demonstration video
tools/record_video.js drives the real app in Chromium: each success
criterion is captioned, then shown working, followed by examples of the
structural and functional tests. The report now names the video and
its source in the AI acknowledgement.

Co-Authored-By: Claude Opus 5.5 <noreply@anthropic.com>
Claude-Session: https://claude.ai/code/session_01XD7kt4NUT5bnr3NetjtefG
</commit_message>
<xml_diff>
--- a/docs/ia/IA_Driving_Theory_Practice.docx
+++ b/docs/ia/IA_Driving_Theory_Practice.docx
@@ -30843,7 +30843,7 @@
         <w:spacing w:after="100"/>
       </w:pPr>
       <w:r>
-        <w:t xml:space="preserve">[TO REVIEW AND COMPLETE BY THE CANDIDATE] Claude (Anthropic), an AI assistant, was used in October 2026 to check this report against the code, to write the automated tests (tests/), the test-data generator (tools/make_test_data.py) and the shuffle comparison (tools/compare_shuffles.js), to fix the three defects described in Criterion D, to generate the diagrams in docs/ia/ and to draft the text of this report. Every statement about the product was checked against the source code and tests/results.json. [Add: any other AI use, e.g. for the English translation of the question bank (tools/translations/), with the prompts and dates.]</w:t>
+        <w:t xml:space="preserve">[TO REVIEW AND COMPLETE BY THE CANDIDATE] Claude (Anthropic), an AI assistant, was used in October 2026 to check this report against the code, to write the automated tests (tests/), the test-data generator (tools/make_test_data.py) and the shuffle comparison (tools/compare_shuffles.js), to fix the three defects described in Criterion D, to generate the diagrams in docs/ia/, to record the demonstration video with tools/record_video.js and to draft the text of this report. Every statement about the product was checked against the source code and tests/results.json. [Add: any other AI use, e.g. for the English translation of the question bank (tools/translations/), with the prompts and dates.]</w:t>
       </w:r>
     </w:p>
     <w:p>
@@ -30859,7 +30859,7 @@
         <w:spacing w:after="100"/>
       </w:pPr>
       <w:r>
-        <w:t xml:space="preserve">Appendix A — Full source code with line numbers (IA_Appendix_A_Source_Code.docx). Appendix B — Test code, test data and full results (tests/). Video — demonstration of every success criterion and of the tests (maximum 5 minutes).</w:t>
+        <w:t xml:space="preserve">Appendix A — Full source code with line numbers (IA_Appendix_A_Source_Code.docx). Appendix B — Test code, test data and full results (tests/). Video — IA_video_Driving_Theory_Practice.mp4: every success criterion named and then shown working, with examples of structural and functional testing (recorded by tools/record_video.js; under 5 minutes).</w:t>
       </w:r>
     </w:p>
     <w:sectPr>

</xml_diff>